<commit_message>
docs: perguntar ao parceiro o preço que ele já pratica
A conta de repasse tem uma âncora que o questionário não capturava: quanto
o lugar cobra hoje e quanto vale uma aula para ele. É de lá que o Wellhub
deriva o repasse — e sem esse número, a resposta de "valor mínimo por
presença" vem no vácuo, sem nada com que comparar.

Três perguntas novas abrem a seção 3 (mensalidade e aulas por semana,
se vende avulso e por quanto, por quanto venderia se não vende). As
seguintes deslocam de 11-31 para 14-34, e a orientação de quem aplica
acompanha a renumeração.

Co-Authored-By: Claude Opus 5 <noreply@anthropic.com>
Claude-Session: https://claude.ai/code/session_01NLrxcC6i1TZuZYrLY2KiVQ
</commit_message>
<xml_diff>
--- a/materiais/Kidoo-pesquisa-estabelecimentos.docx
+++ b/materiais/Kidoo-pesquisa-estabelecimentos.docx
@@ -112,7 +112,7 @@
           <w:sz w:val="22"/>
           <w:szCs w:val="22"/>
         </w:rPr>
-        <w:t xml:space="preserve">Questionário para academias, escolinhas, escolas de dança e clubes · 20 a 25 minutos</w:t>
+        <w:t xml:space="preserve">Questionário para academias, escolinhas, escolas de dança e clubes · 25 a 30 minutos</w:t>
       </w:r>
     </w:p>
     <w:tbl>
@@ -1914,7 +1914,23 @@
           <w:sz w:val="22"/>
           <w:szCs w:val="22"/>
         </w:rPr>
-        <w:t xml:space="preserve">COMO VOCÊ PREENCHE VAGA HOJE</w:t>
+        <w:t xml:space="preserve">SEUS PREÇOS, E COMO VOCÊ PREENCHE VAGA HOJE</w:t>
+      </w:r>
+    </w:p>
+    <w:p>
+      <w:pPr>
+        <w:spacing w:after="120" w:before="0" w:line="264"/>
+      </w:pPr>
+      <w:r>
+        <w:rPr>
+          <w:rFonts w:ascii="Calibri" w:cs="Calibri" w:eastAsia="Calibri" w:hAnsi="Calibri"/>
+          <w:i/>
+          <w:iCs/>
+          <w:color w:val="8E8EA6"/>
+          <w:sz w:val="20"/>
+          <w:szCs w:val="20"/>
+        </w:rPr>
+        <w:t xml:space="preserve">O preço que você já pratica é a referência de tudo o que vem depois. Se tiver a tabela à mão, prefira ela à memória.</w:t>
       </w:r>
     </w:p>
     <w:p>
@@ -1943,7 +1959,96 @@
           <w:sz w:val="21"/>
           <w:szCs w:val="21"/>
         </w:rPr>
-        <w:t xml:space="preserve">Você oferece aula experimental?</w:t>
+        <w:t xml:space="preserve">Qual a mensalidade da sua turma infantil mais comum, e quantas aulas por semana ela tem?</w:t>
+      </w:r>
+    </w:p>
+    <w:tbl>
+      <w:tblPr>
+        <w:tblW w:type="dxa" w:w="9486"/>
+        <w:tblInd w:type="dxa" w:w="260"/>
+        <w:tblBorders>
+          <w:top w:val="single" w:color="auto" w:sz="4"/>
+          <w:left w:val="single" w:color="auto" w:sz="4"/>
+          <w:bottom w:val="single" w:color="auto" w:sz="4"/>
+          <w:right w:val="single" w:color="auto" w:sz="4"/>
+          <w:insideH w:val="single" w:color="auto" w:sz="4"/>
+          <w:insideV w:val="single" w:color="auto" w:sz="4"/>
+        </w:tblBorders>
+      </w:tblPr>
+      <w:tblGrid>
+        <w:gridCol w:w="9486"/>
+      </w:tblGrid>
+      <w:tr>
+        <w:trPr>
+          <w:cantSplit/>
+          <w:trHeight w:val="380" w:hRule="atLeast"/>
+        </w:trPr>
+        <w:tc>
+          <w:tcPr>
+            <w:tcW w:type="dxa" w:w="9486"/>
+            <w:tcBorders>
+              <w:top w:val="none" w:color="FFFFFF" w:sz="0"/>
+              <w:left w:val="none" w:color="FFFFFF" w:sz="0"/>
+              <w:bottom w:val="single" w:color="D9D9E6" w:sz="4"/>
+              <w:right w:val="none" w:color="FFFFFF" w:sz="0"/>
+            </w:tcBorders>
+            <w:tcMar>
+              <w:top w:type="dxa" w:w="0"/>
+              <w:left w:type="dxa" w:w="0"/>
+              <w:bottom w:type="dxa" w:w="0"/>
+              <w:right w:type="dxa" w:w="0"/>
+            </w:tcMar>
+            <w:vAlign w:val="bottom"/>
+          </w:tcPr>
+          <w:p>
+            <w:pPr>
+              <w:spacing w:after="0"/>
+            </w:pPr>
+            <w:r>
+              <w:rPr>
+                <w:rFonts w:ascii="Calibri" w:cs="Calibri" w:eastAsia="Calibri" w:hAnsi="Calibri"/>
+                <w:color w:val="4A4A5F"/>
+                <w:sz w:val="21"/>
+                <w:szCs w:val="21"/>
+              </w:rPr>
+              <w:t xml:space="preserve">R$                                      por mês                     Aulas por semana:  </w:t>
+            </w:r>
+          </w:p>
+        </w:tc>
+      </w:tr>
+    </w:tbl>
+    <w:p>
+      <w:pPr>
+        <w:spacing w:after="120"/>
+      </w:pPr>
+    </w:p>
+    <w:p>
+      <w:pPr>
+        <w:keepNext/>
+        <w:keepLines/>
+        <w:spacing w:after="60" w:before="200"/>
+      </w:pPr>
+      <w:r>
+        <w:rPr>
+          <w:rFonts w:ascii="Calibri" w:cs="Calibri" w:eastAsia="Calibri" w:hAnsi="Calibri"/>
+          <w:b/>
+          <w:bCs/>
+          <w:color w:val="6A3FC6"/>
+          <w:sz w:val="21"/>
+          <w:szCs w:val="21"/>
+        </w:rPr>
+        <w:t xml:space="preserve">12. </w:t>
+      </w:r>
+      <w:r>
+        <w:rPr>
+          <w:rFonts w:ascii="Calibri" w:cs="Calibri" w:eastAsia="Calibri" w:hAnsi="Calibri"/>
+          <w:b/>
+          <w:bCs/>
+          <w:color w:val="1E1E2F"/>
+          <w:sz w:val="21"/>
+          <w:szCs w:val="21"/>
+        </w:rPr>
+        <w:t xml:space="preserve">Você vende aula avulsa hoje, para quem não é matriculado?</w:t>
       </w:r>
     </w:p>
     <w:tbl>
@@ -1989,7 +2094,7 @@
                 <w:sz w:val="21"/>
                 <w:szCs w:val="21"/>
               </w:rPr>
-              <w:t xml:space="preserve">(     )  Sim, gratuita</w:t>
+              <w:t xml:space="preserve">(     )  Sim, vendo — R$</w:t>
             </w:r>
           </w:p>
         </w:tc>
@@ -2014,7 +2119,7 @@
                 <w:sz w:val="21"/>
                 <w:szCs w:val="21"/>
               </w:rPr>
-              <w:t xml:space="preserve">(     )  Sim, paga — valor: R$</w:t>
+              <w:t xml:space="preserve">(     )  Não vendo avulso</w:t>
             </w:r>
           </w:p>
         </w:tc>
@@ -2039,7 +2144,7 @@
                 <w:sz w:val="21"/>
                 <w:szCs w:val="21"/>
               </w:rPr>
-              <w:t xml:space="preserve">(     )  Não ofereço</w:t>
+              <w:t xml:space="preserve">(     )  Só a experimental</w:t>
             </w:r>
           </w:p>
         </w:tc>
@@ -2060,7 +2165,7 @@
           <w:sz w:val="21"/>
           <w:szCs w:val="21"/>
         </w:rPr>
-        <w:t xml:space="preserve">12. </w:t>
+        <w:t xml:space="preserve">13. </w:t>
       </w:r>
       <w:r>
         <w:rPr>
@@ -2071,7 +2176,7 @@
           <w:sz w:val="21"/>
           <w:szCs w:val="21"/>
         </w:rPr>
-        <w:t xml:space="preserve">Nos últimos 3 meses, quantas experimentais você deu, e quantas viraram matrícula?</w:t>
+        <w:t xml:space="preserve">Se não vende: por quanto você venderia uma aula solta, sem matrícula?</w:t>
       </w:r>
     </w:p>
     <w:tbl>
@@ -2123,7 +2228,7 @@
                 <w:sz w:val="21"/>
                 <w:szCs w:val="21"/>
               </w:rPr>
-              <w:t xml:space="preserve">Experimentais:                                              Viraram matrícula:  </w:t>
+              <w:t xml:space="preserve">R$                                      (     ) Não venderia de jeito nenhum  </w:t>
             </w:r>
           </w:p>
         </w:tc>
@@ -2149,7 +2254,7 @@
           <w:sz w:val="21"/>
           <w:szCs w:val="21"/>
         </w:rPr>
-        <w:t xml:space="preserve">13. </w:t>
+        <w:t xml:space="preserve">14. </w:t>
       </w:r>
       <w:r>
         <w:rPr>
@@ -2160,374 +2265,7 @@
           <w:sz w:val="21"/>
           <w:szCs w:val="21"/>
         </w:rPr>
-        <w:t xml:space="preserve">Como chega aluno novo hoje?</w:t>
-      </w:r>
-      <w:r>
-        <w:rPr>
-          <w:rFonts w:ascii="Calibri" w:cs="Calibri" w:eastAsia="Calibri" w:hAnsi="Calibri"/>
-          <w:i/>
-          <w:iCs/>
-          <w:color w:val="8E8EA6"/>
-          <w:sz w:val="18"/>
-          <w:szCs w:val="18"/>
-        </w:rPr>
-        <w:t xml:space="preserve">  (marque tudo que se aplica)</w:t>
-      </w:r>
-    </w:p>
-    <w:tbl>
-      <w:tblPr>
-        <w:tblW w:type="dxa" w:w="9486"/>
-        <w:tblInd w:type="dxa" w:w="260"/>
-        <w:tblBorders>
-          <w:top w:val="none" w:color="FFFFFF" w:sz="0"/>
-          <w:left w:val="none" w:color="FFFFFF" w:sz="0"/>
-          <w:bottom w:val="none" w:color="FFFFFF" w:sz="0"/>
-          <w:right w:val="none" w:color="FFFFFF" w:sz="0"/>
-          <w:insideH w:val="none" w:color="FFFFFF" w:sz="0"/>
-          <w:insideV w:val="none" w:color="FFFFFF" w:sz="0"/>
-        </w:tblBorders>
-      </w:tblPr>
-      <w:tblGrid>
-        <w:gridCol w:w="4743"/>
-        <w:gridCol w:w="4743"/>
-      </w:tblGrid>
-      <w:tr>
-        <w:trPr>
-          <w:cantSplit/>
-        </w:trPr>
-        <w:tc>
-          <w:tcPr>
-            <w:tcW w:type="dxa" w:w="4743"/>
-            <w:tcMar>
-              <w:top w:type="dxa" w:w="20"/>
-              <w:left w:type="dxa" w:w="0"/>
-              <w:bottom w:type="dxa" w:w="20"/>
-              <w:right w:type="dxa" w:w="120"/>
-            </w:tcMar>
-          </w:tcPr>
-          <w:p>
-            <w:pPr>
-              <w:spacing w:after="0"/>
-            </w:pPr>
-            <w:r>
-              <w:rPr>
-                <w:rFonts w:ascii="Calibri" w:cs="Calibri" w:eastAsia="Calibri" w:hAnsi="Calibri"/>
-                <w:color w:val="4A4A5F"/>
-                <w:sz w:val="21"/>
-                <w:szCs w:val="21"/>
-              </w:rPr>
-              <w:t xml:space="preserve">(     )  Indicação de outro aluno</w:t>
-            </w:r>
-          </w:p>
-        </w:tc>
-        <w:tc>
-          <w:tcPr>
-            <w:tcW w:type="dxa" w:w="4743"/>
-            <w:tcMar>
-              <w:top w:type="dxa" w:w="20"/>
-              <w:left w:type="dxa" w:w="0"/>
-              <w:bottom w:type="dxa" w:w="20"/>
-              <w:right w:type="dxa" w:w="120"/>
-            </w:tcMar>
-          </w:tcPr>
-          <w:p>
-            <w:pPr>
-              <w:spacing w:after="0"/>
-            </w:pPr>
-            <w:r>
-              <w:rPr>
-                <w:rFonts w:ascii="Calibri" w:cs="Calibri" w:eastAsia="Calibri" w:hAnsi="Calibri"/>
-                <w:color w:val="4A4A5F"/>
-                <w:sz w:val="21"/>
-                <w:szCs w:val="21"/>
-              </w:rPr>
-              <w:t xml:space="preserve">(     )  Instagram</w:t>
-            </w:r>
-          </w:p>
-        </w:tc>
-      </w:tr>
-      <w:tr>
-        <w:trPr>
-          <w:cantSplit/>
-        </w:trPr>
-        <w:tc>
-          <w:tcPr>
-            <w:tcW w:type="dxa" w:w="4743"/>
-            <w:tcMar>
-              <w:top w:type="dxa" w:w="20"/>
-              <w:left w:type="dxa" w:w="0"/>
-              <w:bottom w:type="dxa" w:w="20"/>
-              <w:right w:type="dxa" w:w="120"/>
-            </w:tcMar>
-          </w:tcPr>
-          <w:p>
-            <w:pPr>
-              <w:spacing w:after="0"/>
-            </w:pPr>
-            <w:r>
-              <w:rPr>
-                <w:rFonts w:ascii="Calibri" w:cs="Calibri" w:eastAsia="Calibri" w:hAnsi="Calibri"/>
-                <w:color w:val="4A4A5F"/>
-                <w:sz w:val="21"/>
-                <w:szCs w:val="21"/>
-              </w:rPr>
-              <w:t xml:space="preserve">(     )  Google / site</w:t>
-            </w:r>
-          </w:p>
-        </w:tc>
-        <w:tc>
-          <w:tcPr>
-            <w:tcW w:type="dxa" w:w="4743"/>
-            <w:tcMar>
-              <w:top w:type="dxa" w:w="20"/>
-              <w:left w:type="dxa" w:w="0"/>
-              <w:bottom w:type="dxa" w:w="20"/>
-              <w:right w:type="dxa" w:w="120"/>
-            </w:tcMar>
-          </w:tcPr>
-          <w:p>
-            <w:pPr>
-              <w:spacing w:after="0"/>
-            </w:pPr>
-            <w:r>
-              <w:rPr>
-                <w:rFonts w:ascii="Calibri" w:cs="Calibri" w:eastAsia="Calibri" w:hAnsi="Calibri"/>
-                <w:color w:val="4A4A5F"/>
-                <w:sz w:val="21"/>
-                <w:szCs w:val="21"/>
-              </w:rPr>
-              <w:t xml:space="preserve">(     )  Panfleto e fachada</w:t>
-            </w:r>
-          </w:p>
-        </w:tc>
-      </w:tr>
-      <w:tr>
-        <w:trPr>
-          <w:cantSplit/>
-        </w:trPr>
-        <w:tc>
-          <w:tcPr>
-            <w:tcW w:type="dxa" w:w="4743"/>
-            <w:tcMar>
-              <w:top w:type="dxa" w:w="20"/>
-              <w:left w:type="dxa" w:w="0"/>
-              <w:bottom w:type="dxa" w:w="20"/>
-              <w:right w:type="dxa" w:w="120"/>
-            </w:tcMar>
-          </w:tcPr>
-          <w:p>
-            <w:pPr>
-              <w:spacing w:after="0"/>
-            </w:pPr>
-            <w:r>
-              <w:rPr>
-                <w:rFonts w:ascii="Calibri" w:cs="Calibri" w:eastAsia="Calibri" w:hAnsi="Calibri"/>
-                <w:color w:val="4A4A5F"/>
-                <w:sz w:val="21"/>
-                <w:szCs w:val="21"/>
-              </w:rPr>
-              <w:t xml:space="preserve">(     )  Parceria com escola</w:t>
-            </w:r>
-          </w:p>
-        </w:tc>
-        <w:tc>
-          <w:tcPr>
-            <w:tcW w:type="dxa" w:w="4743"/>
-            <w:tcMar>
-              <w:top w:type="dxa" w:w="20"/>
-              <w:left w:type="dxa" w:w="0"/>
-              <w:bottom w:type="dxa" w:w="20"/>
-              <w:right w:type="dxa" w:w="120"/>
-            </w:tcMar>
-          </w:tcPr>
-          <w:p>
-            <w:pPr>
-              <w:spacing w:after="0"/>
-            </w:pPr>
-            <w:r>
-              <w:rPr>
-                <w:rFonts w:ascii="Calibri" w:cs="Calibri" w:eastAsia="Calibri" w:hAnsi="Calibri"/>
-                <w:color w:val="4A4A5F"/>
-                <w:sz w:val="21"/>
-                <w:szCs w:val="21"/>
-              </w:rPr>
-              <w:t xml:space="preserve">(     )  WhatsApp de bairro</w:t>
-            </w:r>
-          </w:p>
-        </w:tc>
-      </w:tr>
-      <w:tr>
-        <w:trPr>
-          <w:cantSplit/>
-        </w:trPr>
-        <w:tc>
-          <w:tcPr>
-            <w:tcW w:type="dxa" w:w="4743"/>
-            <w:tcMar>
-              <w:top w:type="dxa" w:w="20"/>
-              <w:left w:type="dxa" w:w="0"/>
-              <w:bottom w:type="dxa" w:w="20"/>
-              <w:right w:type="dxa" w:w="120"/>
-            </w:tcMar>
-          </w:tcPr>
-          <w:p>
-            <w:pPr>
-              <w:spacing w:after="0"/>
-            </w:pPr>
-            <w:r>
-              <w:rPr>
-                <w:rFonts w:ascii="Calibri" w:cs="Calibri" w:eastAsia="Calibri" w:hAnsi="Calibri"/>
-                <w:color w:val="4A4A5F"/>
-                <w:sz w:val="21"/>
-                <w:szCs w:val="21"/>
-              </w:rPr>
-              <w:t xml:space="preserve">(     )  Não faço nada, chega sozinho</w:t>
-            </w:r>
-          </w:p>
-        </w:tc>
-        <w:tc>
-          <w:tcPr>
-            <w:tcW w:type="dxa" w:w="4743"/>
-            <w:tcMar>
-              <w:top w:type="dxa" w:w="20"/>
-              <w:left w:type="dxa" w:w="0"/>
-              <w:bottom w:type="dxa" w:w="20"/>
-              <w:right w:type="dxa" w:w="120"/>
-            </w:tcMar>
-          </w:tcPr>
-          <w:p>
-            <w:pPr>
-              <w:spacing w:after="0"/>
-            </w:pPr>
-            <w:r>
-              <w:rPr>
-                <w:rFonts w:ascii="Calibri" w:cs="Calibri" w:eastAsia="Calibri" w:hAnsi="Calibri"/>
-                <w:color w:val="4A4A5F"/>
-                <w:sz w:val="21"/>
-                <w:szCs w:val="21"/>
-              </w:rPr>
-              <w:t xml:space="preserve">(     )  Outro:</w:t>
-            </w:r>
-          </w:p>
-        </w:tc>
-      </w:tr>
-    </w:tbl>
-    <w:p>
-      <w:pPr>
-        <w:keepNext/>
-        <w:keepLines/>
-        <w:spacing w:after="60" w:before="200"/>
-      </w:pPr>
-      <w:r>
-        <w:rPr>
-          <w:rFonts w:ascii="Calibri" w:cs="Calibri" w:eastAsia="Calibri" w:hAnsi="Calibri"/>
-          <w:b/>
-          <w:bCs/>
-          <w:color w:val="6A3FC6"/>
-          <w:sz w:val="21"/>
-          <w:szCs w:val="21"/>
-        </w:rPr>
-        <w:t xml:space="preserve">14. </w:t>
-      </w:r>
-      <w:r>
-        <w:rPr>
-          <w:rFonts w:ascii="Calibri" w:cs="Calibri" w:eastAsia="Calibri" w:hAnsi="Calibri"/>
-          <w:b/>
-          <w:bCs/>
-          <w:color w:val="1E1E2F"/>
-          <w:sz w:val="21"/>
-          <w:szCs w:val="21"/>
-        </w:rPr>
-        <w:t xml:space="preserve">Quanto você calcula que gasta hoje para conseguir um aluno novo?</w:t>
-      </w:r>
-    </w:p>
-    <w:tbl>
-      <w:tblPr>
-        <w:tblW w:type="dxa" w:w="9486"/>
-        <w:tblInd w:type="dxa" w:w="260"/>
-        <w:tblBorders>
-          <w:top w:val="single" w:color="auto" w:sz="4"/>
-          <w:left w:val="single" w:color="auto" w:sz="4"/>
-          <w:bottom w:val="single" w:color="auto" w:sz="4"/>
-          <w:right w:val="single" w:color="auto" w:sz="4"/>
-          <w:insideH w:val="single" w:color="auto" w:sz="4"/>
-          <w:insideV w:val="single" w:color="auto" w:sz="4"/>
-        </w:tblBorders>
-      </w:tblPr>
-      <w:tblGrid>
-        <w:gridCol w:w="9486"/>
-      </w:tblGrid>
-      <w:tr>
-        <w:trPr>
-          <w:cantSplit/>
-          <w:trHeight w:val="380" w:hRule="atLeast"/>
-        </w:trPr>
-        <w:tc>
-          <w:tcPr>
-            <w:tcW w:type="dxa" w:w="9486"/>
-            <w:tcBorders>
-              <w:top w:val="none" w:color="FFFFFF" w:sz="0"/>
-              <w:left w:val="none" w:color="FFFFFF" w:sz="0"/>
-              <w:bottom w:val="single" w:color="D9D9E6" w:sz="4"/>
-              <w:right w:val="none" w:color="FFFFFF" w:sz="0"/>
-            </w:tcBorders>
-            <w:tcMar>
-              <w:top w:type="dxa" w:w="0"/>
-              <w:left w:type="dxa" w:w="0"/>
-              <w:bottom w:type="dxa" w:w="0"/>
-              <w:right w:type="dxa" w:w="0"/>
-            </w:tcMar>
-            <w:vAlign w:val="bottom"/>
-          </w:tcPr>
-          <w:p>
-            <w:pPr>
-              <w:spacing w:after="0"/>
-            </w:pPr>
-            <w:r>
-              <w:rPr>
-                <w:rFonts w:ascii="Calibri" w:cs="Calibri" w:eastAsia="Calibri" w:hAnsi="Calibri"/>
-                <w:color w:val="4A4A5F"/>
-                <w:sz w:val="21"/>
-                <w:szCs w:val="21"/>
-              </w:rPr>
-              <w:t xml:space="preserve">R$                                                       (     ) Nunca calculei  </w:t>
-            </w:r>
-          </w:p>
-        </w:tc>
-      </w:tr>
-    </w:tbl>
-    <w:p>
-      <w:pPr>
-        <w:spacing w:after="120"/>
-      </w:pPr>
-    </w:p>
-    <w:p>
-      <w:pPr>
-        <w:keepNext/>
-        <w:keepLines/>
-        <w:spacing w:after="60" w:before="200"/>
-      </w:pPr>
-      <w:r>
-        <w:rPr>
-          <w:rFonts w:ascii="Calibri" w:cs="Calibri" w:eastAsia="Calibri" w:hAnsi="Calibri"/>
-          <w:b/>
-          <w:bCs/>
-          <w:color w:val="6A3FC6"/>
-          <w:sz w:val="21"/>
-          <w:szCs w:val="21"/>
-        </w:rPr>
-        <w:t xml:space="preserve">15. </w:t>
-      </w:r>
-      <w:r>
-        <w:rPr>
-          <w:rFonts w:ascii="Calibri" w:cs="Calibri" w:eastAsia="Calibri" w:hAnsi="Calibri"/>
-          <w:b/>
-          <w:bCs/>
-          <w:color w:val="1E1E2F"/>
-          <w:sz w:val="21"/>
-          <w:szCs w:val="21"/>
-        </w:rPr>
-        <w:t xml:space="preserve">Você já trabalhou com Wellhub (Gympass), TotalPass ou plataforma parecida?</w:t>
+        <w:t xml:space="preserve">Você oferece aula experimental?</w:t>
       </w:r>
     </w:p>
     <w:tbl>
@@ -2573,7 +2311,7 @@
                 <w:sz w:val="21"/>
                 <w:szCs w:val="21"/>
               </w:rPr>
-              <w:t xml:space="preserve">(     )  Nunca trabalhei</w:t>
+              <w:t xml:space="preserve">(     )  Sim, gratuita</w:t>
             </w:r>
           </w:p>
         </w:tc>
@@ -2598,7 +2336,7 @@
                 <w:sz w:val="21"/>
                 <w:szCs w:val="21"/>
               </w:rPr>
-              <w:t xml:space="preserve">(     )  Trabalho hoje</w:t>
+              <w:t xml:space="preserve">(     )  Sim, paga — valor: R$</w:t>
             </w:r>
           </w:p>
         </w:tc>
@@ -2623,7 +2361,7 @@
                 <w:sz w:val="21"/>
                 <w:szCs w:val="21"/>
               </w:rPr>
-              <w:t xml:space="preserve">(     )  Já trabalhei e saí</w:t>
+              <w:t xml:space="preserve">(     )  Não ofereço</w:t>
             </w:r>
           </w:p>
         </w:tc>
@@ -2632,16 +2370,30 @@
     <w:p>
       <w:pPr>
         <w:keepNext/>
-        <w:spacing w:after="40" w:before="120"/>
-      </w:pPr>
-      <w:r>
-        <w:rPr>
-          <w:rFonts w:ascii="Calibri" w:cs="Calibri" w:eastAsia="Calibri" w:hAnsi="Calibri"/>
-          <w:color w:val="4A4A5F"/>
-          <w:sz w:val="20"/>
-          <w:szCs w:val="20"/>
-        </w:rPr>
-        <w:t xml:space="preserve">Se trabalhou, como foi? O que funcionou e o que não funcionou?</w:t>
+        <w:keepLines/>
+        <w:spacing w:after="60" w:before="200"/>
+      </w:pPr>
+      <w:r>
+        <w:rPr>
+          <w:rFonts w:ascii="Calibri" w:cs="Calibri" w:eastAsia="Calibri" w:hAnsi="Calibri"/>
+          <w:b/>
+          <w:bCs/>
+          <w:color w:val="6A3FC6"/>
+          <w:sz w:val="21"/>
+          <w:szCs w:val="21"/>
+        </w:rPr>
+        <w:t xml:space="preserve">15. </w:t>
+      </w:r>
+      <w:r>
+        <w:rPr>
+          <w:rFonts w:ascii="Calibri" w:cs="Calibri" w:eastAsia="Calibri" w:hAnsi="Calibri"/>
+          <w:b/>
+          <w:bCs/>
+          <w:color w:val="1E1E2F"/>
+          <w:sz w:val="21"/>
+          <w:szCs w:val="21"/>
+        </w:rPr>
+        <w:t xml:space="preserve">Nos últimos 3 meses, quantas experimentais você deu, e quantas viraram matrícula?</w:t>
       </w:r>
     </w:p>
     <w:tbl>
@@ -2693,83 +2445,7 @@
                 <w:sz w:val="21"/>
                 <w:szCs w:val="21"/>
               </w:rPr>
-              <w:t xml:space="preserve"/>
-            </w:r>
-          </w:p>
-        </w:tc>
-      </w:tr>
-      <w:tr>
-        <w:trPr>
-          <w:cantSplit/>
-          <w:trHeight w:val="380" w:hRule="atLeast"/>
-        </w:trPr>
-        <w:tc>
-          <w:tcPr>
-            <w:tcW w:type="dxa" w:w="9486"/>
-            <w:tcBorders>
-              <w:top w:val="none" w:color="FFFFFF" w:sz="0"/>
-              <w:left w:val="none" w:color="FFFFFF" w:sz="0"/>
-              <w:bottom w:val="single" w:color="D9D9E6" w:sz="4"/>
-              <w:right w:val="none" w:color="FFFFFF" w:sz="0"/>
-            </w:tcBorders>
-            <w:tcMar>
-              <w:top w:type="dxa" w:w="0"/>
-              <w:left w:type="dxa" w:w="0"/>
-              <w:bottom w:type="dxa" w:w="0"/>
-              <w:right w:type="dxa" w:w="0"/>
-            </w:tcMar>
-            <w:vAlign w:val="bottom"/>
-          </w:tcPr>
-          <w:p>
-            <w:pPr>
-              <w:spacing w:after="0"/>
-            </w:pPr>
-            <w:r>
-              <w:rPr>
-                <w:rFonts w:ascii="Calibri" w:cs="Calibri" w:eastAsia="Calibri" w:hAnsi="Calibri"/>
-                <w:color w:val="4A4A5F"/>
-                <w:sz w:val="21"/>
-                <w:szCs w:val="21"/>
-              </w:rPr>
-              <w:t xml:space="preserve"/>
-            </w:r>
-          </w:p>
-        </w:tc>
-      </w:tr>
-      <w:tr>
-        <w:trPr>
-          <w:cantSplit/>
-          <w:trHeight w:val="380" w:hRule="atLeast"/>
-        </w:trPr>
-        <w:tc>
-          <w:tcPr>
-            <w:tcW w:type="dxa" w:w="9486"/>
-            <w:tcBorders>
-              <w:top w:val="none" w:color="FFFFFF" w:sz="0"/>
-              <w:left w:val="none" w:color="FFFFFF" w:sz="0"/>
-              <w:bottom w:val="single" w:color="D9D9E6" w:sz="4"/>
-              <w:right w:val="none" w:color="FFFFFF" w:sz="0"/>
-            </w:tcBorders>
-            <w:tcMar>
-              <w:top w:type="dxa" w:w="0"/>
-              <w:left w:type="dxa" w:w="0"/>
-              <w:bottom w:type="dxa" w:w="0"/>
-              <w:right w:type="dxa" w:w="0"/>
-            </w:tcMar>
-            <w:vAlign w:val="bottom"/>
-          </w:tcPr>
-          <w:p>
-            <w:pPr>
-              <w:spacing w:after="0"/>
-            </w:pPr>
-            <w:r>
-              <w:rPr>
-                <w:rFonts w:ascii="Calibri" w:cs="Calibri" w:eastAsia="Calibri" w:hAnsi="Calibri"/>
-                <w:color w:val="4A4A5F"/>
-                <w:sz w:val="21"/>
-                <w:szCs w:val="21"/>
-              </w:rPr>
-              <w:t xml:space="preserve"/>
+              <w:t xml:space="preserve">Experimentais:                                              Viraram matrícula:  </w:t>
             </w:r>
           </w:p>
         </w:tc>
@@ -2783,10 +2459,8 @@
     <w:p>
       <w:pPr>
         <w:keepNext/>
-        <w:pBdr>
-          <w:bottom w:val="single" w:color="EFE9FB" w:sz="6" w:space="6"/>
-        </w:pBdr>
-        <w:spacing w:after="140" w:before="300"/>
+        <w:keepLines/>
+        <w:spacing w:after="60" w:before="200"/>
       </w:pPr>
       <w:r>
         <w:rPr>
@@ -2794,10 +2468,10 @@
           <w:b/>
           <w:bCs/>
           <w:color w:val="6A3FC6"/>
-          <w:sz w:val="24"/>
-          <w:szCs w:val="24"/>
-        </w:rPr>
-        <w:t xml:space="preserve">04   </w:t>
+          <w:sz w:val="21"/>
+          <w:szCs w:val="21"/>
+        </w:rPr>
+        <w:t xml:space="preserve">16. </w:t>
       </w:r>
       <w:r>
         <w:rPr>
@@ -2805,16 +2479,27 @@
           <w:b/>
           <w:bCs/>
           <w:color w:val="1E1E2F"/>
-          <w:spacing w:val="20"/>
-          <w:sz w:val="22"/>
-          <w:szCs w:val="22"/>
-        </w:rPr>
-        <w:t xml:space="preserve">UMA IDEIA, E O QUE VOCÊ ACHA DELA</w:t>
+          <w:sz w:val="21"/>
+          <w:szCs w:val="21"/>
+        </w:rPr>
+        <w:t xml:space="preserve">Como chega aluno novo hoje?</w:t>
+      </w:r>
+      <w:r>
+        <w:rPr>
+          <w:rFonts w:ascii="Calibri" w:cs="Calibri" w:eastAsia="Calibri" w:hAnsi="Calibri"/>
+          <w:i/>
+          <w:iCs/>
+          <w:color w:val="8E8EA6"/>
+          <w:sz w:val="18"/>
+          <w:szCs w:val="18"/>
+        </w:rPr>
+        <w:t xml:space="preserve">  (marque tudo que se aplica)</w:t>
       </w:r>
     </w:p>
     <w:tbl>
       <w:tblPr>
-        <w:tblW w:type="dxa" w:w="9746"/>
+        <w:tblW w:type="dxa" w:w="9486"/>
+        <w:tblInd w:type="dxa" w:w="260"/>
         <w:tblBorders>
           <w:top w:val="none" w:color="FFFFFF" w:sz="0"/>
           <w:left w:val="none" w:color="FFFFFF" w:sz="0"/>
@@ -2825,72 +2510,230 @@
         </w:tblBorders>
       </w:tblPr>
       <w:tblGrid>
-        <w:gridCol w:w="9746"/>
+        <w:gridCol w:w="4743"/>
+        <w:gridCol w:w="4743"/>
       </w:tblGrid>
       <w:tr>
-        <w:tc>
-          <w:tcPr>
-            <w:tcW w:type="dxa" w:w="9746"/>
-            <w:shd w:fill="F7F4FE" w:color="auto" w:val="clear"/>
-            <w:tcMar>
-              <w:top w:type="dxa" w:w="200"/>
-              <w:left w:type="dxa" w:w="240"/>
-              <w:bottom w:type="dxa" w:w="200"/>
-              <w:right w:type="dxa" w:w="240"/>
-            </w:tcMar>
-          </w:tcPr>
-          <w:p>
-            <w:pPr>
-              <w:spacing w:after="160" w:before="0" w:line="264"/>
-            </w:pPr>
-            <w:r>
-              <w:rPr>
-                <w:rFonts w:ascii="Calibri" w:cs="Calibri" w:eastAsia="Calibri" w:hAnsi="Calibri"/>
-                <w:b/>
-                <w:bCs/>
-                <w:color w:val="1E1E2F"/>
-                <w:sz w:val="22"/>
-                <w:szCs w:val="22"/>
-              </w:rPr>
-              <w:t xml:space="preserve">Um aplicativo em que a família assina um plano mensal — não com você, com a plataforma.</w:t>
-            </w:r>
-          </w:p>
-          <w:p>
-            <w:pPr>
-              <w:spacing w:after="160" w:before="0" w:line="264"/>
-            </w:pPr>
-            <w:r>
-              <w:rPr>
-                <w:rFonts w:ascii="Calibri" w:cs="Calibri" w:eastAsia="Calibri" w:hAnsi="Calibri"/>
-                <w:color w:val="4A4A5F"/>
-                <w:sz w:val="21"/>
-                <w:szCs w:val="21"/>
-              </w:rPr>
-              <w:t xml:space="preserve">Com esse plano, ela reserva aulas avulsas em lugares diferentes, aula por aula, sem matrícula em nenhum deles. Você escolhe quais turmas entram e quantos lugares abre em cada uma — 2, 5, ou nenhum nesta semana.</w:t>
-            </w:r>
-          </w:p>
-          <w:p>
-            <w:pPr>
-              <w:spacing w:after="0" w:before="0" w:line="264"/>
-            </w:pPr>
-            <w:r>
-              <w:rPr>
-                <w:rFonts w:ascii="Calibri" w:cs="Calibri" w:eastAsia="Calibri" w:hAnsi="Calibri"/>
-                <w:color w:val="4A4A5F"/>
-                <w:sz w:val="21"/>
-                <w:szCs w:val="21"/>
-              </w:rPr>
-              <w:t xml:space="preserve">A criança chega, você digita um código de seis dígitos no painel e aquela presença vira repasse. Sem o código, não há repasse. Sem exclusividade, sem mensalidade e sem multa para sair.</w:t>
+        <w:trPr>
+          <w:cantSplit/>
+        </w:trPr>
+        <w:tc>
+          <w:tcPr>
+            <w:tcW w:type="dxa" w:w="4743"/>
+            <w:tcMar>
+              <w:top w:type="dxa" w:w="20"/>
+              <w:left w:type="dxa" w:w="0"/>
+              <w:bottom w:type="dxa" w:w="20"/>
+              <w:right w:type="dxa" w:w="120"/>
+            </w:tcMar>
+          </w:tcPr>
+          <w:p>
+            <w:pPr>
+              <w:spacing w:after="0"/>
+            </w:pPr>
+            <w:r>
+              <w:rPr>
+                <w:rFonts w:ascii="Calibri" w:cs="Calibri" w:eastAsia="Calibri" w:hAnsi="Calibri"/>
+                <w:color w:val="4A4A5F"/>
+                <w:sz w:val="21"/>
+                <w:szCs w:val="21"/>
+              </w:rPr>
+              <w:t xml:space="preserve">(     )  Indicação de outro aluno</w:t>
+            </w:r>
+          </w:p>
+        </w:tc>
+        <w:tc>
+          <w:tcPr>
+            <w:tcW w:type="dxa" w:w="4743"/>
+            <w:tcMar>
+              <w:top w:type="dxa" w:w="20"/>
+              <w:left w:type="dxa" w:w="0"/>
+              <w:bottom w:type="dxa" w:w="20"/>
+              <w:right w:type="dxa" w:w="120"/>
+            </w:tcMar>
+          </w:tcPr>
+          <w:p>
+            <w:pPr>
+              <w:spacing w:after="0"/>
+            </w:pPr>
+            <w:r>
+              <w:rPr>
+                <w:rFonts w:ascii="Calibri" w:cs="Calibri" w:eastAsia="Calibri" w:hAnsi="Calibri"/>
+                <w:color w:val="4A4A5F"/>
+                <w:sz w:val="21"/>
+                <w:szCs w:val="21"/>
+              </w:rPr>
+              <w:t xml:space="preserve">(     )  Instagram</w:t>
+            </w:r>
+          </w:p>
+        </w:tc>
+      </w:tr>
+      <w:tr>
+        <w:trPr>
+          <w:cantSplit/>
+        </w:trPr>
+        <w:tc>
+          <w:tcPr>
+            <w:tcW w:type="dxa" w:w="4743"/>
+            <w:tcMar>
+              <w:top w:type="dxa" w:w="20"/>
+              <w:left w:type="dxa" w:w="0"/>
+              <w:bottom w:type="dxa" w:w="20"/>
+              <w:right w:type="dxa" w:w="120"/>
+            </w:tcMar>
+          </w:tcPr>
+          <w:p>
+            <w:pPr>
+              <w:spacing w:after="0"/>
+            </w:pPr>
+            <w:r>
+              <w:rPr>
+                <w:rFonts w:ascii="Calibri" w:cs="Calibri" w:eastAsia="Calibri" w:hAnsi="Calibri"/>
+                <w:color w:val="4A4A5F"/>
+                <w:sz w:val="21"/>
+                <w:szCs w:val="21"/>
+              </w:rPr>
+              <w:t xml:space="preserve">(     )  Google / site</w:t>
+            </w:r>
+          </w:p>
+        </w:tc>
+        <w:tc>
+          <w:tcPr>
+            <w:tcW w:type="dxa" w:w="4743"/>
+            <w:tcMar>
+              <w:top w:type="dxa" w:w="20"/>
+              <w:left w:type="dxa" w:w="0"/>
+              <w:bottom w:type="dxa" w:w="20"/>
+              <w:right w:type="dxa" w:w="120"/>
+            </w:tcMar>
+          </w:tcPr>
+          <w:p>
+            <w:pPr>
+              <w:spacing w:after="0"/>
+            </w:pPr>
+            <w:r>
+              <w:rPr>
+                <w:rFonts w:ascii="Calibri" w:cs="Calibri" w:eastAsia="Calibri" w:hAnsi="Calibri"/>
+                <w:color w:val="4A4A5F"/>
+                <w:sz w:val="21"/>
+                <w:szCs w:val="21"/>
+              </w:rPr>
+              <w:t xml:space="preserve">(     )  Panfleto e fachada</w:t>
+            </w:r>
+          </w:p>
+        </w:tc>
+      </w:tr>
+      <w:tr>
+        <w:trPr>
+          <w:cantSplit/>
+        </w:trPr>
+        <w:tc>
+          <w:tcPr>
+            <w:tcW w:type="dxa" w:w="4743"/>
+            <w:tcMar>
+              <w:top w:type="dxa" w:w="20"/>
+              <w:left w:type="dxa" w:w="0"/>
+              <w:bottom w:type="dxa" w:w="20"/>
+              <w:right w:type="dxa" w:w="120"/>
+            </w:tcMar>
+          </w:tcPr>
+          <w:p>
+            <w:pPr>
+              <w:spacing w:after="0"/>
+            </w:pPr>
+            <w:r>
+              <w:rPr>
+                <w:rFonts w:ascii="Calibri" w:cs="Calibri" w:eastAsia="Calibri" w:hAnsi="Calibri"/>
+                <w:color w:val="4A4A5F"/>
+                <w:sz w:val="21"/>
+                <w:szCs w:val="21"/>
+              </w:rPr>
+              <w:t xml:space="preserve">(     )  Parceria com escola</w:t>
+            </w:r>
+          </w:p>
+        </w:tc>
+        <w:tc>
+          <w:tcPr>
+            <w:tcW w:type="dxa" w:w="4743"/>
+            <w:tcMar>
+              <w:top w:type="dxa" w:w="20"/>
+              <w:left w:type="dxa" w:w="0"/>
+              <w:bottom w:type="dxa" w:w="20"/>
+              <w:right w:type="dxa" w:w="120"/>
+            </w:tcMar>
+          </w:tcPr>
+          <w:p>
+            <w:pPr>
+              <w:spacing w:after="0"/>
+            </w:pPr>
+            <w:r>
+              <w:rPr>
+                <w:rFonts w:ascii="Calibri" w:cs="Calibri" w:eastAsia="Calibri" w:hAnsi="Calibri"/>
+                <w:color w:val="4A4A5F"/>
+                <w:sz w:val="21"/>
+                <w:szCs w:val="21"/>
+              </w:rPr>
+              <w:t xml:space="preserve">(     )  WhatsApp de bairro</w:t>
+            </w:r>
+          </w:p>
+        </w:tc>
+      </w:tr>
+      <w:tr>
+        <w:trPr>
+          <w:cantSplit/>
+        </w:trPr>
+        <w:tc>
+          <w:tcPr>
+            <w:tcW w:type="dxa" w:w="4743"/>
+            <w:tcMar>
+              <w:top w:type="dxa" w:w="20"/>
+              <w:left w:type="dxa" w:w="0"/>
+              <w:bottom w:type="dxa" w:w="20"/>
+              <w:right w:type="dxa" w:w="120"/>
+            </w:tcMar>
+          </w:tcPr>
+          <w:p>
+            <w:pPr>
+              <w:spacing w:after="0"/>
+            </w:pPr>
+            <w:r>
+              <w:rPr>
+                <w:rFonts w:ascii="Calibri" w:cs="Calibri" w:eastAsia="Calibri" w:hAnsi="Calibri"/>
+                <w:color w:val="4A4A5F"/>
+                <w:sz w:val="21"/>
+                <w:szCs w:val="21"/>
+              </w:rPr>
+              <w:t xml:space="preserve">(     )  Não faço nada, chega sozinho</w:t>
+            </w:r>
+          </w:p>
+        </w:tc>
+        <w:tc>
+          <w:tcPr>
+            <w:tcW w:type="dxa" w:w="4743"/>
+            <w:tcMar>
+              <w:top w:type="dxa" w:w="20"/>
+              <w:left w:type="dxa" w:w="0"/>
+              <w:bottom w:type="dxa" w:w="20"/>
+              <w:right w:type="dxa" w:w="120"/>
+            </w:tcMar>
+          </w:tcPr>
+          <w:p>
+            <w:pPr>
+              <w:spacing w:after="0"/>
+            </w:pPr>
+            <w:r>
+              <w:rPr>
+                <w:rFonts w:ascii="Calibri" w:cs="Calibri" w:eastAsia="Calibri" w:hAnsi="Calibri"/>
+                <w:color w:val="4A4A5F"/>
+                <w:sz w:val="21"/>
+                <w:szCs w:val="21"/>
+              </w:rPr>
+              <w:t xml:space="preserve">(     )  Outro:</w:t>
             </w:r>
           </w:p>
         </w:tc>
       </w:tr>
     </w:tbl>
-    <w:p>
-      <w:pPr>
-        <w:spacing w:after="120"/>
-      </w:pPr>
-    </w:p>
     <w:p>
       <w:pPr>
         <w:keepNext/>
@@ -2906,7 +2749,7 @@
           <w:sz w:val="21"/>
           <w:szCs w:val="21"/>
         </w:rPr>
-        <w:t xml:space="preserve">16. </w:t>
+        <w:t xml:space="preserve">17. </w:t>
       </w:r>
       <w:r>
         <w:rPr>
@@ -2917,7 +2760,7 @@
           <w:sz w:val="21"/>
           <w:szCs w:val="21"/>
         </w:rPr>
-        <w:t xml:space="preserve">Qual foi a sua primeira reação, em uma palavra?</w:t>
+        <w:t xml:space="preserve">Quanto você calcula que gasta hoje para conseguir um aluno novo?</w:t>
       </w:r>
     </w:p>
     <w:tbl>
@@ -2969,7 +2812,7 @@
                 <w:sz w:val="21"/>
                 <w:szCs w:val="21"/>
               </w:rPr>
-              <w:t xml:space="preserve"/>
+              <w:t xml:space="preserve">R$                                                       (     ) Nunca calculei  </w:t>
             </w:r>
           </w:p>
         </w:tc>
@@ -2995,7 +2838,486 @@
           <w:sz w:val="21"/>
           <w:szCs w:val="21"/>
         </w:rPr>
-        <w:t xml:space="preserve">17. </w:t>
+        <w:t xml:space="preserve">18. </w:t>
+      </w:r>
+      <w:r>
+        <w:rPr>
+          <w:rFonts w:ascii="Calibri" w:cs="Calibri" w:eastAsia="Calibri" w:hAnsi="Calibri"/>
+          <w:b/>
+          <w:bCs/>
+          <w:color w:val="1E1E2F"/>
+          <w:sz w:val="21"/>
+          <w:szCs w:val="21"/>
+        </w:rPr>
+        <w:t xml:space="preserve">Você já trabalhou com Wellhub (Gympass), TotalPass ou plataforma parecida?</w:t>
+      </w:r>
+    </w:p>
+    <w:tbl>
+      <w:tblPr>
+        <w:tblW w:type="dxa" w:w="9486"/>
+        <w:tblInd w:type="dxa" w:w="260"/>
+        <w:tblBorders>
+          <w:top w:val="none" w:color="FFFFFF" w:sz="0"/>
+          <w:left w:val="none" w:color="FFFFFF" w:sz="0"/>
+          <w:bottom w:val="none" w:color="FFFFFF" w:sz="0"/>
+          <w:right w:val="none" w:color="FFFFFF" w:sz="0"/>
+          <w:insideH w:val="none" w:color="FFFFFF" w:sz="0"/>
+          <w:insideV w:val="none" w:color="FFFFFF" w:sz="0"/>
+        </w:tblBorders>
+      </w:tblPr>
+      <w:tblGrid>
+        <w:gridCol w:w="3162"/>
+        <w:gridCol w:w="3162"/>
+        <w:gridCol w:w="3162"/>
+      </w:tblGrid>
+      <w:tr>
+        <w:trPr>
+          <w:cantSplit/>
+        </w:trPr>
+        <w:tc>
+          <w:tcPr>
+            <w:tcW w:type="dxa" w:w="3162"/>
+            <w:tcMar>
+              <w:top w:type="dxa" w:w="20"/>
+              <w:left w:type="dxa" w:w="0"/>
+              <w:bottom w:type="dxa" w:w="20"/>
+              <w:right w:type="dxa" w:w="120"/>
+            </w:tcMar>
+          </w:tcPr>
+          <w:p>
+            <w:pPr>
+              <w:spacing w:after="0"/>
+            </w:pPr>
+            <w:r>
+              <w:rPr>
+                <w:rFonts w:ascii="Calibri" w:cs="Calibri" w:eastAsia="Calibri" w:hAnsi="Calibri"/>
+                <w:color w:val="4A4A5F"/>
+                <w:sz w:val="21"/>
+                <w:szCs w:val="21"/>
+              </w:rPr>
+              <w:t xml:space="preserve">(     )  Nunca trabalhei</w:t>
+            </w:r>
+          </w:p>
+        </w:tc>
+        <w:tc>
+          <w:tcPr>
+            <w:tcW w:type="dxa" w:w="3162"/>
+            <w:tcMar>
+              <w:top w:type="dxa" w:w="20"/>
+              <w:left w:type="dxa" w:w="0"/>
+              <w:bottom w:type="dxa" w:w="20"/>
+              <w:right w:type="dxa" w:w="120"/>
+            </w:tcMar>
+          </w:tcPr>
+          <w:p>
+            <w:pPr>
+              <w:spacing w:after="0"/>
+            </w:pPr>
+            <w:r>
+              <w:rPr>
+                <w:rFonts w:ascii="Calibri" w:cs="Calibri" w:eastAsia="Calibri" w:hAnsi="Calibri"/>
+                <w:color w:val="4A4A5F"/>
+                <w:sz w:val="21"/>
+                <w:szCs w:val="21"/>
+              </w:rPr>
+              <w:t xml:space="preserve">(     )  Trabalho hoje</w:t>
+            </w:r>
+          </w:p>
+        </w:tc>
+        <w:tc>
+          <w:tcPr>
+            <w:tcW w:type="dxa" w:w="3162"/>
+            <w:tcMar>
+              <w:top w:type="dxa" w:w="20"/>
+              <w:left w:type="dxa" w:w="0"/>
+              <w:bottom w:type="dxa" w:w="20"/>
+              <w:right w:type="dxa" w:w="120"/>
+            </w:tcMar>
+          </w:tcPr>
+          <w:p>
+            <w:pPr>
+              <w:spacing w:after="0"/>
+            </w:pPr>
+            <w:r>
+              <w:rPr>
+                <w:rFonts w:ascii="Calibri" w:cs="Calibri" w:eastAsia="Calibri" w:hAnsi="Calibri"/>
+                <w:color w:val="4A4A5F"/>
+                <w:sz w:val="21"/>
+                <w:szCs w:val="21"/>
+              </w:rPr>
+              <w:t xml:space="preserve">(     )  Já trabalhei e saí</w:t>
+            </w:r>
+          </w:p>
+        </w:tc>
+      </w:tr>
+    </w:tbl>
+    <w:p>
+      <w:pPr>
+        <w:keepNext/>
+        <w:spacing w:after="40" w:before="120"/>
+      </w:pPr>
+      <w:r>
+        <w:rPr>
+          <w:rFonts w:ascii="Calibri" w:cs="Calibri" w:eastAsia="Calibri" w:hAnsi="Calibri"/>
+          <w:color w:val="4A4A5F"/>
+          <w:sz w:val="20"/>
+          <w:szCs w:val="20"/>
+        </w:rPr>
+        <w:t xml:space="preserve">Se trabalhou, como foi? O que funcionou e o que não funcionou?</w:t>
+      </w:r>
+    </w:p>
+    <w:tbl>
+      <w:tblPr>
+        <w:tblW w:type="dxa" w:w="9486"/>
+        <w:tblInd w:type="dxa" w:w="260"/>
+        <w:tblBorders>
+          <w:top w:val="single" w:color="auto" w:sz="4"/>
+          <w:left w:val="single" w:color="auto" w:sz="4"/>
+          <w:bottom w:val="single" w:color="auto" w:sz="4"/>
+          <w:right w:val="single" w:color="auto" w:sz="4"/>
+          <w:insideH w:val="single" w:color="auto" w:sz="4"/>
+          <w:insideV w:val="single" w:color="auto" w:sz="4"/>
+        </w:tblBorders>
+      </w:tblPr>
+      <w:tblGrid>
+        <w:gridCol w:w="9486"/>
+      </w:tblGrid>
+      <w:tr>
+        <w:trPr>
+          <w:cantSplit/>
+          <w:trHeight w:val="380" w:hRule="atLeast"/>
+        </w:trPr>
+        <w:tc>
+          <w:tcPr>
+            <w:tcW w:type="dxa" w:w="9486"/>
+            <w:tcBorders>
+              <w:top w:val="none" w:color="FFFFFF" w:sz="0"/>
+              <w:left w:val="none" w:color="FFFFFF" w:sz="0"/>
+              <w:bottom w:val="single" w:color="D9D9E6" w:sz="4"/>
+              <w:right w:val="none" w:color="FFFFFF" w:sz="0"/>
+            </w:tcBorders>
+            <w:tcMar>
+              <w:top w:type="dxa" w:w="0"/>
+              <w:left w:type="dxa" w:w="0"/>
+              <w:bottom w:type="dxa" w:w="0"/>
+              <w:right w:type="dxa" w:w="0"/>
+            </w:tcMar>
+            <w:vAlign w:val="bottom"/>
+          </w:tcPr>
+          <w:p>
+            <w:pPr>
+              <w:spacing w:after="0"/>
+            </w:pPr>
+            <w:r>
+              <w:rPr>
+                <w:rFonts w:ascii="Calibri" w:cs="Calibri" w:eastAsia="Calibri" w:hAnsi="Calibri"/>
+                <w:color w:val="4A4A5F"/>
+                <w:sz w:val="21"/>
+                <w:szCs w:val="21"/>
+              </w:rPr>
+              <w:t xml:space="preserve"/>
+            </w:r>
+          </w:p>
+        </w:tc>
+      </w:tr>
+      <w:tr>
+        <w:trPr>
+          <w:cantSplit/>
+          <w:trHeight w:val="380" w:hRule="atLeast"/>
+        </w:trPr>
+        <w:tc>
+          <w:tcPr>
+            <w:tcW w:type="dxa" w:w="9486"/>
+            <w:tcBorders>
+              <w:top w:val="none" w:color="FFFFFF" w:sz="0"/>
+              <w:left w:val="none" w:color="FFFFFF" w:sz="0"/>
+              <w:bottom w:val="single" w:color="D9D9E6" w:sz="4"/>
+              <w:right w:val="none" w:color="FFFFFF" w:sz="0"/>
+            </w:tcBorders>
+            <w:tcMar>
+              <w:top w:type="dxa" w:w="0"/>
+              <w:left w:type="dxa" w:w="0"/>
+              <w:bottom w:type="dxa" w:w="0"/>
+              <w:right w:type="dxa" w:w="0"/>
+            </w:tcMar>
+            <w:vAlign w:val="bottom"/>
+          </w:tcPr>
+          <w:p>
+            <w:pPr>
+              <w:spacing w:after="0"/>
+            </w:pPr>
+            <w:r>
+              <w:rPr>
+                <w:rFonts w:ascii="Calibri" w:cs="Calibri" w:eastAsia="Calibri" w:hAnsi="Calibri"/>
+                <w:color w:val="4A4A5F"/>
+                <w:sz w:val="21"/>
+                <w:szCs w:val="21"/>
+              </w:rPr>
+              <w:t xml:space="preserve"/>
+            </w:r>
+          </w:p>
+        </w:tc>
+      </w:tr>
+      <w:tr>
+        <w:trPr>
+          <w:cantSplit/>
+          <w:trHeight w:val="380" w:hRule="atLeast"/>
+        </w:trPr>
+        <w:tc>
+          <w:tcPr>
+            <w:tcW w:type="dxa" w:w="9486"/>
+            <w:tcBorders>
+              <w:top w:val="none" w:color="FFFFFF" w:sz="0"/>
+              <w:left w:val="none" w:color="FFFFFF" w:sz="0"/>
+              <w:bottom w:val="single" w:color="D9D9E6" w:sz="4"/>
+              <w:right w:val="none" w:color="FFFFFF" w:sz="0"/>
+            </w:tcBorders>
+            <w:tcMar>
+              <w:top w:type="dxa" w:w="0"/>
+              <w:left w:type="dxa" w:w="0"/>
+              <w:bottom w:type="dxa" w:w="0"/>
+              <w:right w:type="dxa" w:w="0"/>
+            </w:tcMar>
+            <w:vAlign w:val="bottom"/>
+          </w:tcPr>
+          <w:p>
+            <w:pPr>
+              <w:spacing w:after="0"/>
+            </w:pPr>
+            <w:r>
+              <w:rPr>
+                <w:rFonts w:ascii="Calibri" w:cs="Calibri" w:eastAsia="Calibri" w:hAnsi="Calibri"/>
+                <w:color w:val="4A4A5F"/>
+                <w:sz w:val="21"/>
+                <w:szCs w:val="21"/>
+              </w:rPr>
+              <w:t xml:space="preserve"/>
+            </w:r>
+          </w:p>
+        </w:tc>
+      </w:tr>
+    </w:tbl>
+    <w:p>
+      <w:pPr>
+        <w:spacing w:after="120"/>
+      </w:pPr>
+    </w:p>
+    <w:p>
+      <w:pPr>
+        <w:keepNext/>
+        <w:pBdr>
+          <w:bottom w:val="single" w:color="EFE9FB" w:sz="6" w:space="6"/>
+        </w:pBdr>
+        <w:spacing w:after="140" w:before="300"/>
+      </w:pPr>
+      <w:r>
+        <w:rPr>
+          <w:rFonts w:ascii="Calibri" w:cs="Calibri" w:eastAsia="Calibri" w:hAnsi="Calibri"/>
+          <w:b/>
+          <w:bCs/>
+          <w:color w:val="6A3FC6"/>
+          <w:sz w:val="24"/>
+          <w:szCs w:val="24"/>
+        </w:rPr>
+        <w:t xml:space="preserve">04   </w:t>
+      </w:r>
+      <w:r>
+        <w:rPr>
+          <w:rFonts w:ascii="Calibri" w:cs="Calibri" w:eastAsia="Calibri" w:hAnsi="Calibri"/>
+          <w:b/>
+          <w:bCs/>
+          <w:color w:val="1E1E2F"/>
+          <w:spacing w:val="20"/>
+          <w:sz w:val="22"/>
+          <w:szCs w:val="22"/>
+        </w:rPr>
+        <w:t xml:space="preserve">UMA IDEIA, E O QUE VOCÊ ACHA DELA</w:t>
+      </w:r>
+    </w:p>
+    <w:tbl>
+      <w:tblPr>
+        <w:tblW w:type="dxa" w:w="9746"/>
+        <w:tblBorders>
+          <w:top w:val="none" w:color="FFFFFF" w:sz="0"/>
+          <w:left w:val="none" w:color="FFFFFF" w:sz="0"/>
+          <w:bottom w:val="none" w:color="FFFFFF" w:sz="0"/>
+          <w:right w:val="none" w:color="FFFFFF" w:sz="0"/>
+          <w:insideH w:val="none" w:color="FFFFFF" w:sz="0"/>
+          <w:insideV w:val="none" w:color="FFFFFF" w:sz="0"/>
+        </w:tblBorders>
+      </w:tblPr>
+      <w:tblGrid>
+        <w:gridCol w:w="9746"/>
+      </w:tblGrid>
+      <w:tr>
+        <w:tc>
+          <w:tcPr>
+            <w:tcW w:type="dxa" w:w="9746"/>
+            <w:shd w:fill="F7F4FE" w:color="auto" w:val="clear"/>
+            <w:tcMar>
+              <w:top w:type="dxa" w:w="200"/>
+              <w:left w:type="dxa" w:w="240"/>
+              <w:bottom w:type="dxa" w:w="200"/>
+              <w:right w:type="dxa" w:w="240"/>
+            </w:tcMar>
+          </w:tcPr>
+          <w:p>
+            <w:pPr>
+              <w:spacing w:after="160" w:before="0" w:line="264"/>
+            </w:pPr>
+            <w:r>
+              <w:rPr>
+                <w:rFonts w:ascii="Calibri" w:cs="Calibri" w:eastAsia="Calibri" w:hAnsi="Calibri"/>
+                <w:b/>
+                <w:bCs/>
+                <w:color w:val="1E1E2F"/>
+                <w:sz w:val="22"/>
+                <w:szCs w:val="22"/>
+              </w:rPr>
+              <w:t xml:space="preserve">Um aplicativo em que a família assina um plano mensal — não com você, com a plataforma.</w:t>
+            </w:r>
+          </w:p>
+          <w:p>
+            <w:pPr>
+              <w:spacing w:after="160" w:before="0" w:line="264"/>
+            </w:pPr>
+            <w:r>
+              <w:rPr>
+                <w:rFonts w:ascii="Calibri" w:cs="Calibri" w:eastAsia="Calibri" w:hAnsi="Calibri"/>
+                <w:color w:val="4A4A5F"/>
+                <w:sz w:val="21"/>
+                <w:szCs w:val="21"/>
+              </w:rPr>
+              <w:t xml:space="preserve">Com esse plano, ela reserva aulas avulsas em lugares diferentes, aula por aula, sem matrícula em nenhum deles. Você escolhe quais turmas entram e quantos lugares abre em cada uma — 2, 5, ou nenhum nesta semana.</w:t>
+            </w:r>
+          </w:p>
+          <w:p>
+            <w:pPr>
+              <w:spacing w:after="0" w:before="0" w:line="264"/>
+            </w:pPr>
+            <w:r>
+              <w:rPr>
+                <w:rFonts w:ascii="Calibri" w:cs="Calibri" w:eastAsia="Calibri" w:hAnsi="Calibri"/>
+                <w:color w:val="4A4A5F"/>
+                <w:sz w:val="21"/>
+                <w:szCs w:val="21"/>
+              </w:rPr>
+              <w:t xml:space="preserve">A criança chega, você digita um código de seis dígitos no painel e aquela presença vira repasse. Sem o código, não há repasse. Sem exclusividade, sem mensalidade e sem multa para sair.</w:t>
+            </w:r>
+          </w:p>
+        </w:tc>
+      </w:tr>
+    </w:tbl>
+    <w:p>
+      <w:pPr>
+        <w:spacing w:after="120"/>
+      </w:pPr>
+    </w:p>
+    <w:p>
+      <w:pPr>
+        <w:keepNext/>
+        <w:keepLines/>
+        <w:spacing w:after="60" w:before="200"/>
+      </w:pPr>
+      <w:r>
+        <w:rPr>
+          <w:rFonts w:ascii="Calibri" w:cs="Calibri" w:eastAsia="Calibri" w:hAnsi="Calibri"/>
+          <w:b/>
+          <w:bCs/>
+          <w:color w:val="6A3FC6"/>
+          <w:sz w:val="21"/>
+          <w:szCs w:val="21"/>
+        </w:rPr>
+        <w:t xml:space="preserve">19. </w:t>
+      </w:r>
+      <w:r>
+        <w:rPr>
+          <w:rFonts w:ascii="Calibri" w:cs="Calibri" w:eastAsia="Calibri" w:hAnsi="Calibri"/>
+          <w:b/>
+          <w:bCs/>
+          <w:color w:val="1E1E2F"/>
+          <w:sz w:val="21"/>
+          <w:szCs w:val="21"/>
+        </w:rPr>
+        <w:t xml:space="preserve">Qual foi a sua primeira reação, em uma palavra?</w:t>
+      </w:r>
+    </w:p>
+    <w:tbl>
+      <w:tblPr>
+        <w:tblW w:type="dxa" w:w="9486"/>
+        <w:tblInd w:type="dxa" w:w="260"/>
+        <w:tblBorders>
+          <w:top w:val="single" w:color="auto" w:sz="4"/>
+          <w:left w:val="single" w:color="auto" w:sz="4"/>
+          <w:bottom w:val="single" w:color="auto" w:sz="4"/>
+          <w:right w:val="single" w:color="auto" w:sz="4"/>
+          <w:insideH w:val="single" w:color="auto" w:sz="4"/>
+          <w:insideV w:val="single" w:color="auto" w:sz="4"/>
+        </w:tblBorders>
+      </w:tblPr>
+      <w:tblGrid>
+        <w:gridCol w:w="9486"/>
+      </w:tblGrid>
+      <w:tr>
+        <w:trPr>
+          <w:cantSplit/>
+          <w:trHeight w:val="380" w:hRule="atLeast"/>
+        </w:trPr>
+        <w:tc>
+          <w:tcPr>
+            <w:tcW w:type="dxa" w:w="9486"/>
+            <w:tcBorders>
+              <w:top w:val="none" w:color="FFFFFF" w:sz="0"/>
+              <w:left w:val="none" w:color="FFFFFF" w:sz="0"/>
+              <w:bottom w:val="single" w:color="D9D9E6" w:sz="4"/>
+              <w:right w:val="none" w:color="FFFFFF" w:sz="0"/>
+            </w:tcBorders>
+            <w:tcMar>
+              <w:top w:type="dxa" w:w="0"/>
+              <w:left w:type="dxa" w:w="0"/>
+              <w:bottom w:type="dxa" w:w="0"/>
+              <w:right w:type="dxa" w:w="0"/>
+            </w:tcMar>
+            <w:vAlign w:val="bottom"/>
+          </w:tcPr>
+          <w:p>
+            <w:pPr>
+              <w:spacing w:after="0"/>
+            </w:pPr>
+            <w:r>
+              <w:rPr>
+                <w:rFonts w:ascii="Calibri" w:cs="Calibri" w:eastAsia="Calibri" w:hAnsi="Calibri"/>
+                <w:color w:val="4A4A5F"/>
+                <w:sz w:val="21"/>
+                <w:szCs w:val="21"/>
+              </w:rPr>
+              <w:t xml:space="preserve"/>
+            </w:r>
+          </w:p>
+        </w:tc>
+      </w:tr>
+    </w:tbl>
+    <w:p>
+      <w:pPr>
+        <w:spacing w:after="120"/>
+      </w:pPr>
+    </w:p>
+    <w:p>
+      <w:pPr>
+        <w:keepNext/>
+        <w:keepLines/>
+        <w:spacing w:after="60" w:before="200"/>
+      </w:pPr>
+      <w:r>
+        <w:rPr>
+          <w:rFonts w:ascii="Calibri" w:cs="Calibri" w:eastAsia="Calibri" w:hAnsi="Calibri"/>
+          <w:b/>
+          <w:bCs/>
+          <w:color w:val="6A3FC6"/>
+          <w:sz w:val="21"/>
+          <w:szCs w:val="21"/>
+        </w:rPr>
+        <w:t xml:space="preserve">20. </w:t>
       </w:r>
       <w:r>
         <w:rPr>
@@ -3510,7 +3832,7 @@
           <w:sz w:val="21"/>
           <w:szCs w:val="21"/>
         </w:rPr>
-        <w:t xml:space="preserve">18. </w:t>
+        <w:t xml:space="preserve">21. </w:t>
       </w:r>
       <w:r>
         <w:rPr>
@@ -3675,7 +3997,7 @@
           <w:sz w:val="21"/>
           <w:szCs w:val="21"/>
         </w:rPr>
-        <w:t xml:space="preserve">19. </w:t>
+        <w:t xml:space="preserve">22. </w:t>
       </w:r>
       <w:r>
         <w:rPr>
@@ -4238,7 +4560,7 @@
           <w:sz w:val="21"/>
           <w:szCs w:val="21"/>
         </w:rPr>
-        <w:t xml:space="preserve">20. </w:t>
+        <w:t xml:space="preserve">23. </w:t>
       </w:r>
       <w:r>
         <w:rPr>
@@ -4327,7 +4649,7 @@
           <w:sz w:val="21"/>
           <w:szCs w:val="21"/>
         </w:rPr>
-        <w:t xml:space="preserve">21. </w:t>
+        <w:t xml:space="preserve">24. </w:t>
       </w:r>
       <w:r>
         <w:rPr>
@@ -4416,7 +4738,7 @@
           <w:sz w:val="21"/>
           <w:szCs w:val="21"/>
         </w:rPr>
-        <w:t xml:space="preserve">22. </w:t>
+        <w:t xml:space="preserve">25. </w:t>
       </w:r>
       <w:r>
         <w:rPr>
@@ -4505,7 +4827,7 @@
           <w:sz w:val="21"/>
           <w:szCs w:val="21"/>
         </w:rPr>
-        <w:t xml:space="preserve">23. </w:t>
+        <w:t xml:space="preserve">26. </w:t>
       </w:r>
       <w:r>
         <w:rPr>
@@ -4713,7 +5035,7 @@
           <w:sz w:val="21"/>
           <w:szCs w:val="21"/>
         </w:rPr>
-        <w:t xml:space="preserve">24. </w:t>
+        <w:t xml:space="preserve">27. </w:t>
       </w:r>
       <w:r>
         <w:rPr>
@@ -4841,7 +5163,7 @@
           <w:sz w:val="21"/>
           <w:szCs w:val="21"/>
         </w:rPr>
-        <w:t xml:space="preserve">25. </w:t>
+        <w:t xml:space="preserve">28. </w:t>
       </w:r>
       <w:r>
         <w:rPr>
@@ -5030,7 +5352,7 @@
           <w:sz w:val="21"/>
           <w:szCs w:val="21"/>
         </w:rPr>
-        <w:t xml:space="preserve">26. </w:t>
+        <w:t xml:space="preserve">29. </w:t>
       </w:r>
       <w:r>
         <w:rPr>
@@ -5242,7 +5564,7 @@
           <w:sz w:val="21"/>
           <w:szCs w:val="21"/>
         </w:rPr>
-        <w:t xml:space="preserve">27. </w:t>
+        <w:t xml:space="preserve">30. </w:t>
       </w:r>
       <w:r>
         <w:rPr>
@@ -5399,7 +5721,7 @@
           <w:sz w:val="21"/>
           <w:szCs w:val="21"/>
         </w:rPr>
-        <w:t xml:space="preserve">28. </w:t>
+        <w:t xml:space="preserve">31. </w:t>
       </w:r>
       <w:r>
         <w:rPr>
@@ -5914,7 +6236,7 @@
           <w:sz w:val="21"/>
           <w:szCs w:val="21"/>
         </w:rPr>
-        <w:t xml:space="preserve">29. </w:t>
+        <w:t xml:space="preserve">32. </w:t>
       </w:r>
       <w:r>
         <w:rPr>
@@ -6073,7 +6395,7 @@
           <w:sz w:val="21"/>
           <w:szCs w:val="21"/>
         </w:rPr>
-        <w:t xml:space="preserve">30. </w:t>
+        <w:t xml:space="preserve">33. </w:t>
       </w:r>
       <w:r>
         <w:rPr>
@@ -6153,7 +6475,7 @@
           <w:sz w:val="21"/>
           <w:szCs w:val="21"/>
         </w:rPr>
-        <w:t xml:space="preserve">31. </w:t>
+        <w:t xml:space="preserve">34. </w:t>
       </w:r>
       <w:r>
         <w:rPr>
@@ -6501,7 +6823,7 @@
           <w:sz w:val="21"/>
           <w:szCs w:val="21"/>
         </w:rPr>
-        <w:t xml:space="preserve">Nas 20 a 22 o entrevistado vai chutar alto. Anote o número alto. Se você discutir, ele para de responder e passa a negociar — e aí a pesquisa acabou.</w:t>
+        <w:t xml:space="preserve">Nas 23 a 25 o entrevistado vai chutar alto. Anote o número alto. Se você discutir, ele para de responder e passa a negociar — e aí a pesquisa acabou.</w:t>
       </w:r>
     </w:p>
     <w:p>
@@ -6517,7 +6839,7 @@
           <w:sz w:val="21"/>
           <w:szCs w:val="21"/>
         </w:rPr>
-        <w:t xml:space="preserve">A pergunta 19 é sobre medo, não sobre fato. </w:t>
+        <w:t xml:space="preserve">A pergunta 22 é sobre medo, não sobre fato. </w:t>
       </w:r>
       <w:r>
         <w:rPr>
@@ -6542,7 +6864,7 @@
           <w:sz w:val="21"/>
           <w:szCs w:val="21"/>
         </w:rPr>
-        <w:t xml:space="preserve">A 29 vale ouro. </w:t>
+        <w:t xml:space="preserve">A 32 vale ouro. </w:t>
       </w:r>
       <w:r>
         <w:rPr>
@@ -6638,7 +6960,7 @@
                 <w:sz w:val="21"/>
                 <w:szCs w:val="21"/>
               </w:rPr>
-              <w:t xml:space="preserve">Não conta: elogio à ideia, "interessante", nota alta na 17. Isso é educação.</w:t>
+              <w:t xml:space="preserve">Não conta: elogio à ideia, "interessante", nota alta na 20. Isso é educação.</w:t>
             </w:r>
           </w:p>
           <w:p>
@@ -6652,7 +6974,7 @@
                 <w:sz w:val="21"/>
                 <w:szCs w:val="21"/>
               </w:rPr>
-              <w:t xml:space="preserve">Conta: sobra de lugar confirmada na seção 2, um valor mínimo na 20 que caiba na nossa conta, e um "sim, pode me procurar" na 30 com contato deixado. Três parceiros com essas três coisas valem mais que trinta conversas simpáticas.</w:t>
+              <w:t xml:space="preserve">Conta: sobra de lugar confirmada na seção 2, um valor mínimo na 23 que caiba na nossa conta, e um "sim, pode me procurar" na 33 com contato deixado. Três parceiros com essas três coisas valem mais que trinta conversas simpáticas.</w:t>
             </w:r>
           </w:p>
         </w:tc>

</xml_diff>